<commit_message>
Financeiro: valores de mensalidade por escola, análise por escola, CPF do responsável, correção Mapple->Maple, contrato sem marcação amarela
</commit_message>
<xml_diff>
--- a/public/templates/contrato-modelo.docx
+++ b/public/templates/contrato-modelo.docx
@@ -134,7 +134,6 @@
           <w:rFonts w:ascii="Arial" w:hAnsi="Arial" w:cs="Arial"/>
           <w:sz w:val="24"/>
           <w:szCs w:val="24"/>
-          <w:highlight w:val="yellow"/>
         </w:rPr>
         <w:t>{{nome_contratante}}</w:t>
       </w:r>
@@ -151,7 +150,6 @@
           <w:rFonts w:ascii="Arial" w:hAnsi="Arial" w:cs="Arial"/>
           <w:sz w:val="24"/>
           <w:szCs w:val="24"/>
-          <w:highlight w:val="yellow"/>
         </w:rPr>
         <w:t>{{cpf_contratante}}</w:t>
       </w:r>
@@ -168,7 +166,6 @@
           <w:rFonts w:ascii="Arial" w:hAnsi="Arial" w:cs="Arial"/>
           <w:sz w:val="24"/>
           <w:szCs w:val="24"/>
-          <w:highlight w:val="yellow"/>
         </w:rPr>
         <w:t>{{endereco_contratante}}</w:t>
       </w:r>
@@ -240,7 +237,6 @@
           <w:rFonts w:ascii="Arial" w:hAnsi="Arial" w:cs="Arial"/>
           <w:sz w:val="24"/>
           <w:szCs w:val="24"/>
-          <w:highlight w:val="yellow"/>
         </w:rPr>
         <w:t>{{nome_aluna}}</w:t>
       </w:r>
@@ -257,7 +253,6 @@
           <w:rFonts w:ascii="Arial" w:hAnsi="Arial" w:cs="Arial"/>
           <w:sz w:val="24"/>
           <w:szCs w:val="24"/>
-          <w:highlight w:val="yellow"/>
         </w:rPr>
         <w:t xml:space="preserve">{{dias_horarios_turma}}</w:t>
       </w:r>
@@ -274,7 +269,6 @@
           <w:rFonts w:ascii="Arial" w:hAnsi="Arial" w:cs="Arial"/>
           <w:sz w:val="24"/>
           <w:szCs w:val="24"/>
-          <w:highlight w:val="yellow"/>
         </w:rPr>
         <w:t xml:space="preserve">Sendo o plano escolhido pagamento {{plano}}.</w:t>
       </w:r>
@@ -1263,7 +1257,6 @@
           <w:rFonts w:ascii="Arial" w:hAnsi="Arial" w:cs="Arial"/>
           <w:sz w:val="24"/>
           <w:szCs w:val="24"/>
-          <w:highlight w:val="yellow"/>
         </w:rPr>
         <w:t xml:space="preserve">{{data_assinatura}}</w:t>
       </w:r>
@@ -1366,7 +1359,6 @@
                 <w:rFonts w:ascii="Arial" w:hAnsi="Arial" w:cs="Arial"/>
                 <w:sz w:val="24"/>
                 <w:szCs w:val="24"/>
-                <w:highlight w:val="yellow"/>
               </w:rPr>
               <w:t>{{nome_contratante}}</w:t>
             </w:r>

</xml_diff>